<commit_message>
docs: Add resume files in DOCX and PDF formats.
</commit_message>
<xml_diff>
--- a/public/CV/cjblack_resume.docx
+++ b/public/CV/cjblack_resume.docx
@@ -15,8 +15,8 @@
         <w:tblLook w:val="05E0" w:firstRow="1" w:lastRow="1" w:firstColumn="1" w:lastColumn="1" w:noHBand="0" w:noVBand="1"/>
       </w:tblPr>
       <w:tblGrid>
-        <w:gridCol w:w="3870"/>
-        <w:gridCol w:w="8036"/>
+        <w:gridCol w:w="4050"/>
+        <w:gridCol w:w="7856"/>
       </w:tblGrid>
       <w:tr>
         <w:trPr>
@@ -25,7 +25,7 @@
         </w:trPr>
         <w:tc>
           <w:tcPr>
-            <w:tcW w:w="3870" w:type="dxa"/>
+            <w:tcW w:w="4050" w:type="dxa"/>
             <w:shd w:val="clear" w:color="auto" w:fill="094D73"/>
             <w:tcMar>
               <w:top w:w="300" w:type="dxa"/>
@@ -93,9 +93,9 @@
                 <w:szCs w:val="22"/>
               </w:rPr>
               <w:drawing>
-                <wp:inline distT="0" distB="0" distL="0" distR="0" wp14:anchorId="7803CA47" wp14:editId="69943458">
-                  <wp:extent cx="2118360" cy="2118360"/>
-                  <wp:effectExtent l="0" t="0" r="0" b="0"/>
+                <wp:inline distT="0" distB="0" distL="0" distR="0" wp14:anchorId="7803CA47" wp14:editId="45C42023">
+                  <wp:extent cx="2186940" cy="2186940"/>
+                  <wp:effectExtent l="0" t="0" r="3810" b="3810"/>
                   <wp:docPr id="1" name="Picture 1"/>
                   <wp:cNvGraphicFramePr>
                     <a:graphicFrameLocks xmlns:a="http://schemas.openxmlformats.org/drawingml/2006/main" noChangeAspect="1"/>
@@ -122,7 +122,7 @@
                         <pic:spPr>
                           <a:xfrm>
                             <a:off x="0" y="0"/>
-                            <a:ext cx="2118360" cy="2118360"/>
+                            <a:ext cx="2186940" cy="2186940"/>
                           </a:xfrm>
                           <a:prstGeom prst="rect">
                             <a:avLst/>
@@ -145,6 +145,8 @@
               <w:rPr>
                 <w:rStyle w:val="divdocumentleft-box"/>
                 <w:rFonts w:ascii="Century Gothic" w:eastAsia="Century Gothic" w:hAnsi="Century Gothic" w:cs="Century Gothic"/>
+                <w:sz w:val="48"/>
+                <w:szCs w:val="48"/>
                 <w:shd w:val="clear" w:color="auto" w:fill="auto"/>
               </w:rPr>
             </w:pPr>
@@ -152,13 +154,26 @@
               <w:rPr>
                 <w:rStyle w:val="span"/>
                 <w:rFonts w:ascii="Century Gothic" w:eastAsia="Century Gothic" w:hAnsi="Century Gothic" w:cs="Century Gothic"/>
-              </w:rPr>
-              <w:t>Christian John C.</w:t>
+                <w:sz w:val="48"/>
+                <w:szCs w:val="48"/>
+              </w:rPr>
+              <w:t>Christian John C</w:t>
+            </w:r>
+            <w:r>
+              <w:rPr>
+                <w:rStyle w:val="span"/>
+                <w:rFonts w:ascii="Century Gothic" w:eastAsia="Century Gothic" w:hAnsi="Century Gothic" w:cs="Century Gothic"/>
+                <w:sz w:val="48"/>
+                <w:szCs w:val="48"/>
+              </w:rPr>
+              <w:t>alderon</w:t>
             </w:r>
             <w:r>
               <w:rPr>
                 <w:rStyle w:val="divdocumentleft-box"/>
                 <w:rFonts w:ascii="Century Gothic" w:eastAsia="Century Gothic" w:hAnsi="Century Gothic" w:cs="Century Gothic"/>
+                <w:sz w:val="48"/>
+                <w:szCs w:val="48"/>
                 <w:shd w:val="clear" w:color="auto" w:fill="auto"/>
               </w:rPr>
               <w:t xml:space="preserve"> </w:t>
@@ -167,6 +182,8 @@
               <w:rPr>
                 <w:rStyle w:val="span"/>
                 <w:rFonts w:ascii="Century Gothic" w:eastAsia="Century Gothic" w:hAnsi="Century Gothic" w:cs="Century Gothic"/>
+                <w:sz w:val="48"/>
+                <w:szCs w:val="48"/>
               </w:rPr>
               <w:t>Duque</w:t>
             </w:r>
@@ -206,7 +223,7 @@
               <w:tblLook w:val="05E0" w:firstRow="1" w:lastRow="1" w:firstColumn="1" w:lastColumn="1" w:noHBand="0" w:noVBand="1"/>
             </w:tblPr>
             <w:tblGrid>
-              <w:gridCol w:w="3870"/>
+              <w:gridCol w:w="4050"/>
             </w:tblGrid>
             <w:tr>
               <w:trPr>
@@ -500,7 +517,27 @@
                 <w:szCs w:val="22"/>
                 <w:shd w:val="clear" w:color="auto" w:fill="auto"/>
               </w:rPr>
-              <w:t>https://cjblack-dev-minimalistic-portfolio.vercel.app</w:t>
+              <w:t>https://cjblack-dev-minimalistic</w:t>
+            </w:r>
+            <w:r>
+              <w:rPr>
+                <w:rStyle w:val="divdocumentleft-box"/>
+                <w:rFonts w:ascii="Century Gothic" w:eastAsia="Century Gothic" w:hAnsi="Century Gothic" w:cs="Century Gothic"/>
+                <w:sz w:val="22"/>
+                <w:szCs w:val="22"/>
+                <w:shd w:val="clear" w:color="auto" w:fill="auto"/>
+              </w:rPr>
+              <w:t>-</w:t>
+            </w:r>
+            <w:r>
+              <w:rPr>
+                <w:rStyle w:val="divdocumentleft-box"/>
+                <w:rFonts w:ascii="Century Gothic" w:eastAsia="Century Gothic" w:hAnsi="Century Gothic" w:cs="Century Gothic"/>
+                <w:sz w:val="22"/>
+                <w:szCs w:val="22"/>
+                <w:shd w:val="clear" w:color="auto" w:fill="auto"/>
+              </w:rPr>
+              <w:t>portfolio.vercel.app</w:t>
             </w:r>
           </w:p>
           <w:p>
@@ -608,7 +645,7 @@
               <w:tblLook w:val="05E0" w:firstRow="1" w:lastRow="1" w:firstColumn="1" w:lastColumn="1" w:noHBand="0" w:noVBand="1"/>
             </w:tblPr>
             <w:tblGrid>
-              <w:gridCol w:w="3870"/>
+              <w:gridCol w:w="4050"/>
             </w:tblGrid>
             <w:tr>
               <w:trPr>
@@ -1077,7 +1114,7 @@
         </w:tc>
         <w:tc>
           <w:tcPr>
-            <w:tcW w:w="8036" w:type="dxa"/>
+            <w:tcW w:w="7856" w:type="dxa"/>
             <w:shd w:val="clear" w:color="auto" w:fill="auto"/>
             <w:tcMar>
               <w:top w:w="300" w:type="dxa"/>
@@ -1154,28 +1191,28 @@
                 <w:sz w:val="22"/>
                 <w:szCs w:val="22"/>
               </w:rPr>
-              <w:t>Looking for an OJT opportunity where I can support a development</w:t>
-            </w:r>
-            <w:r>
+              <w:t xml:space="preserve">I’m looking for an on-the-job training opportunity where I can learn </w:t>
+            </w:r>
+          </w:p>
+          <w:p>
+            <w:pPr>
+              <w:pStyle w:val="divdocumentsectiongapdiv"/>
               <w:rPr>
                 <w:rFonts w:ascii="Century Gothic" w:eastAsia="Calibri" w:hAnsi="Century Gothic" w:cs="Calibri"/>
                 <w:color w:val="404040" w:themeColor="text1" w:themeTint="BF"/>
                 <w:sz w:val="22"/>
                 <w:szCs w:val="22"/>
               </w:rPr>
-              <w:t xml:space="preserve"> </w:t>
-            </w:r>
-          </w:p>
-          <w:p>
-            <w:pPr>
-              <w:pStyle w:val="divdocumentsectiongapdiv"/>
+            </w:pPr>
+            <w:r>
               <w:rPr>
                 <w:rFonts w:ascii="Century Gothic" w:eastAsia="Calibri" w:hAnsi="Century Gothic" w:cs="Calibri"/>
                 <w:color w:val="404040" w:themeColor="text1" w:themeTint="BF"/>
                 <w:sz w:val="22"/>
                 <w:szCs w:val="22"/>
               </w:rPr>
-            </w:pPr>
+              <w:t xml:space="preserve">      </w:t>
+            </w:r>
             <w:r>
               <w:rPr>
                 <w:rFonts w:ascii="Century Gothic" w:eastAsia="Calibri" w:hAnsi="Century Gothic" w:cs="Calibri"/>
@@ -1183,7 +1220,7 @@
                 <w:sz w:val="22"/>
                 <w:szCs w:val="22"/>
               </w:rPr>
-              <w:t xml:space="preserve">      team by applying my knowledge of React, Node.js and MongoDB.</w:t>
+              <w:t xml:space="preserve">from an experienced development team and support real-world </w:t>
             </w:r>
           </w:p>
           <w:p>
@@ -1203,37 +1240,27 @@
                 <w:sz w:val="22"/>
                 <w:szCs w:val="22"/>
               </w:rPr>
-              <w:t xml:space="preserve">      Eager to learn from experienced engineers in web or mobile</w:t>
-            </w:r>
-          </w:p>
-          <w:p>
-            <w:pPr>
-              <w:pStyle w:val="divdocumentsectiongapdiv"/>
+              <w:t xml:space="preserve">      </w:t>
+            </w:r>
+            <w:r>
               <w:rPr>
                 <w:rFonts w:ascii="Century Gothic" w:eastAsia="Calibri" w:hAnsi="Century Gothic" w:cs="Calibri"/>
                 <w:color w:val="404040" w:themeColor="text1" w:themeTint="BF"/>
                 <w:sz w:val="22"/>
                 <w:szCs w:val="22"/>
               </w:rPr>
-            </w:pPr>
-            <w:r>
+              <w:t xml:space="preserve">projects. I’m especially interested in web and mobile development, </w:t>
+            </w:r>
+          </w:p>
+          <w:p>
+            <w:pPr>
+              <w:pStyle w:val="divdocumentsectiongapdiv"/>
               <w:rPr>
                 <w:rFonts w:ascii="Century Gothic" w:eastAsia="Calibri" w:hAnsi="Century Gothic" w:cs="Calibri"/>
                 <w:color w:val="404040" w:themeColor="text1" w:themeTint="BF"/>
                 <w:sz w:val="22"/>
                 <w:szCs w:val="22"/>
               </w:rPr>
-              <w:t xml:space="preserve">      development practices, and grow into a valuable contributor in a </w:t>
-            </w:r>
-          </w:p>
-          <w:p>
-            <w:pPr>
-              <w:pStyle w:val="divdocumentsectiongapdiv"/>
-              <w:rPr>
-                <w:rFonts w:ascii="Century Gothic" w:eastAsia="Calibri" w:hAnsi="Century Gothic" w:cs="Calibri"/>
-                <w:sz w:val="22"/>
-                <w:szCs w:val="22"/>
-              </w:rPr>
             </w:pPr>
             <w:r>
               <w:rPr>
@@ -1242,15 +1269,45 @@
                 <w:sz w:val="22"/>
                 <w:szCs w:val="22"/>
               </w:rPr>
-              <w:t xml:space="preserve">      professional environment</w:t>
+              <w:t xml:space="preserve">      </w:t>
             </w:r>
             <w:r>
               <w:rPr>
                 <w:rFonts w:ascii="Century Gothic" w:eastAsia="Calibri" w:hAnsi="Century Gothic" w:cs="Calibri"/>
-                <w:sz w:val="22"/>
-                <w:szCs w:val="22"/>
-              </w:rPr>
-              <w:t>.</w:t>
+                <w:color w:val="404040" w:themeColor="text1" w:themeTint="BF"/>
+                <w:sz w:val="22"/>
+                <w:szCs w:val="22"/>
+              </w:rPr>
+              <w:t>and I also enjoy UI/UX design. I’m excited to grow my skills, contribute</w:t>
+            </w:r>
+          </w:p>
+          <w:p>
+            <w:pPr>
+              <w:pStyle w:val="divdocumentsectiongapdiv"/>
+              <w:rPr>
+                <w:rFonts w:ascii="Century Gothic" w:eastAsia="Calibri" w:hAnsi="Century Gothic" w:cs="Calibri"/>
+                <w:color w:val="404040" w:themeColor="text1" w:themeTint="BF"/>
+                <w:sz w:val="22"/>
+                <w:szCs w:val="22"/>
+              </w:rPr>
+            </w:pPr>
+            <w:r>
+              <w:rPr>
+                <w:rFonts w:ascii="Century Gothic" w:eastAsia="Calibri" w:hAnsi="Century Gothic" w:cs="Calibri"/>
+                <w:color w:val="404040" w:themeColor="text1" w:themeTint="BF"/>
+                <w:sz w:val="22"/>
+                <w:szCs w:val="22"/>
+              </w:rPr>
+              <w:t xml:space="preserve">     </w:t>
+            </w:r>
+            <w:r>
+              <w:rPr>
+                <w:rFonts w:ascii="Century Gothic" w:eastAsia="Calibri" w:hAnsi="Century Gothic" w:cs="Calibri"/>
+                <w:color w:val="404040" w:themeColor="text1" w:themeTint="BF"/>
+                <w:sz w:val="22"/>
+                <w:szCs w:val="22"/>
+              </w:rPr>
+              <w:t xml:space="preserve"> where I can, and become a helpful member of a professional team.</w:t>
             </w:r>
           </w:p>
           <w:p>
@@ -1407,7 +1464,7 @@
                       <w:sz w:val="22"/>
                       <w:szCs w:val="22"/>
                     </w:rPr>
-                    <w:t>Expected in</w:t>
+                    <w:t>Present</w:t>
                   </w:r>
                   <w:r>
                     <w:rPr>
@@ -1418,20 +1475,11 @@
                       <w:sz w:val="22"/>
                       <w:szCs w:val="22"/>
                     </w:rPr>
-                    <w:t xml:space="preserve"> </w:t>
+                    <w:t xml:space="preserve"> in</w:t>
                   </w:r>
                   <w:r>
                     <w:rPr>
-                      <w:rStyle w:val="divdocumentjobdates"/>
-                      <w:rFonts w:ascii="Century Gothic" w:eastAsia="Century Gothic" w:hAnsi="Century Gothic" w:cs="Century Gothic"/>
-                      <w:color w:val="343434"/>
-                      <w:spacing w:val="4"/>
-                    </w:rPr>
-                    <w:t>2026-04</w:t>
-                  </w:r>
-                  <w:r>
-                    <w:rPr>
-                      <w:rStyle w:val="divdocumentright-boxpaddedlinedate-content"/>
+                      <w:rStyle w:val="span"/>
                       <w:rFonts w:ascii="Century Gothic" w:eastAsia="Century Gothic" w:hAnsi="Century Gothic" w:cs="Century Gothic"/>
                       <w:color w:val="343434"/>
                       <w:spacing w:val="4"/>
@@ -1439,6 +1487,24 @@
                       <w:szCs w:val="22"/>
                     </w:rPr>
                     <w:t xml:space="preserve"> </w:t>
+                  </w:r>
+                  <w:r>
+                    <w:rPr>
+                      <w:rStyle w:val="divdocumentjobdates"/>
+                      <w:rFonts w:ascii="Century Gothic" w:eastAsia="Century Gothic" w:hAnsi="Century Gothic" w:cs="Century Gothic"/>
+                      <w:color w:val="343434"/>
+                      <w:spacing w:val="4"/>
+                    </w:rPr>
+                    <w:t>202</w:t>
+                  </w:r>
+                  <w:r>
+                    <w:rPr>
+                      <w:rStyle w:val="divdocumentjobdates"/>
+                      <w:rFonts w:ascii="Century Gothic" w:eastAsia="Century Gothic" w:hAnsi="Century Gothic" w:cs="Century Gothic"/>
+                      <w:color w:val="343434"/>
+                      <w:spacing w:val="4"/>
+                    </w:rPr>
+                    <w:t xml:space="preserve">2 - </w:t>
                   </w:r>
                 </w:p>
               </w:tc>
@@ -1515,20 +1581,18 @@
                       <w:color w:val="343434"/>
                       <w:spacing w:val="4"/>
                     </w:rPr>
-                    <w:t>Bachelor of Science</w:t>
+                    <w:t>Bachelor of Scienc</w:t>
                   </w:r>
                   <w:r>
                     <w:rPr>
-                      <w:rStyle w:val="span"/>
+                      <w:rStyle w:val="divdocumentdegree"/>
                       <w:rFonts w:ascii="Century Gothic" w:eastAsia="Century Gothic" w:hAnsi="Century Gothic" w:cs="Century Gothic"/>
                       <w:b/>
                       <w:bCs/>
                       <w:color w:val="343434"/>
                       <w:spacing w:val="4"/>
-                      <w:sz w:val="22"/>
-                      <w:szCs w:val="22"/>
-                    </w:rPr>
-                    <w:t xml:space="preserve">: </w:t>
+                    </w:rPr>
+                    <w:t xml:space="preserve">e in </w:t>
                   </w:r>
                   <w:r>
                     <w:rPr>
@@ -1852,6 +1916,15 @@
                 <w:sz w:val="22"/>
                 <w:szCs w:val="22"/>
               </w:rPr>
+              <w:t xml:space="preserve"> </w:t>
+            </w:r>
+            <w:r>
+              <w:rPr>
+                <w:rStyle w:val="divdocumentright-box"/>
+                <w:rFonts w:ascii="Century Gothic" w:eastAsia="Century Gothic" w:hAnsi="Century Gothic" w:cs="Century Gothic"/>
+                <w:sz w:val="22"/>
+                <w:szCs w:val="22"/>
+              </w:rPr>
               <w:t>CSS | Java</w:t>
             </w:r>
             <w:r>
@@ -2111,6 +2184,35 @@
                 <w:sz w:val="22"/>
                 <w:szCs w:val="22"/>
               </w:rPr>
+              <w:t xml:space="preserve"> </w:t>
+            </w:r>
+            <w:proofErr w:type="spellStart"/>
+            <w:r>
+              <w:rPr>
+                <w:rStyle w:val="divdocumentright-box"/>
+                <w:rFonts w:ascii="Century Gothic" w:eastAsia="Century Gothic" w:hAnsi="Century Gothic" w:cs="Century Gothic"/>
+                <w:sz w:val="22"/>
+                <w:szCs w:val="22"/>
+              </w:rPr>
+              <w:t>Supabase</w:t>
+            </w:r>
+            <w:proofErr w:type="spellEnd"/>
+            <w:r>
+              <w:rPr>
+                <w:rStyle w:val="divdocumentright-box"/>
+                <w:rFonts w:ascii="Century Gothic" w:eastAsia="Century Gothic" w:hAnsi="Century Gothic" w:cs="Century Gothic"/>
+                <w:sz w:val="22"/>
+                <w:szCs w:val="22"/>
+              </w:rPr>
+              <w:t>,</w:t>
+            </w:r>
+            <w:r>
+              <w:rPr>
+                <w:rStyle w:val="divdocumentright-box"/>
+                <w:rFonts w:ascii="Century Gothic" w:eastAsia="Century Gothic" w:hAnsi="Century Gothic" w:cs="Century Gothic"/>
+                <w:sz w:val="22"/>
+                <w:szCs w:val="22"/>
+              </w:rPr>
               <w:t xml:space="preserve"> React-Native, Expo, </w:t>
             </w:r>
             <w:r>
@@ -2140,7 +2242,7 @@
                 <w:sz w:val="22"/>
                 <w:szCs w:val="22"/>
               </w:rPr>
-              <w:t xml:space="preserve">                          </w:t>
+              <w:t xml:space="preserve">            </w:t>
             </w:r>
           </w:p>
           <w:p>
@@ -2308,8 +2410,44 @@
                 <w:sz w:val="22"/>
                 <w:szCs w:val="22"/>
               </w:rPr>
-              <w:t xml:space="preserve">Good Communication </w:t>
-            </w:r>
+              <w:t>Problem Solver</w:t>
+            </w:r>
+          </w:p>
+          <w:p>
+            <w:pPr>
+              <w:pStyle w:val="divdocumentsectiongapdiv"/>
+              <w:numPr>
+                <w:ilvl w:val="0"/>
+                <w:numId w:val="2"/>
+              </w:numPr>
+              <w:rPr>
+                <w:rStyle w:val="divdocumentright-box"/>
+                <w:rFonts w:ascii="Century Gothic" w:eastAsia="Century Gothic" w:hAnsi="Century Gothic" w:cs="Century Gothic"/>
+                <w:sz w:val="22"/>
+                <w:szCs w:val="22"/>
+              </w:rPr>
+            </w:pPr>
+            <w:r>
+              <w:rPr>
+                <w:rStyle w:val="divdocumentright-box"/>
+                <w:rFonts w:ascii="Century Gothic" w:eastAsia="Century Gothic" w:hAnsi="Century Gothic" w:cs="Century Gothic"/>
+                <w:sz w:val="22"/>
+                <w:szCs w:val="22"/>
+              </w:rPr>
+              <w:t>Good communication</w:t>
+            </w:r>
+          </w:p>
+          <w:p>
+            <w:pPr>
+              <w:pStyle w:val="divdocumentsectiongapdiv"/>
+              <w:ind w:left="684"/>
+              <w:rPr>
+                <w:rStyle w:val="divdocumentright-box"/>
+                <w:rFonts w:ascii="Century Gothic" w:eastAsia="Century Gothic" w:hAnsi="Century Gothic" w:cs="Century Gothic"/>
+                <w:sz w:val="22"/>
+                <w:szCs w:val="22"/>
+              </w:rPr>
+            </w:pPr>
           </w:p>
           <w:p>
             <w:pPr>
@@ -2341,22 +2479,6 @@
                 <w:shd w:val="clear" w:color="auto" w:fill="auto"/>
               </w:rPr>
               <w:t>Certifications</w:t>
-            </w:r>
-          </w:p>
-          <w:p>
-            <w:pPr>
-              <w:pStyle w:val="left-boxheadinggapdiv"/>
-              <w:rPr>
-                <w:rStyle w:val="divdocumentright-box"/>
-                <w:rFonts w:ascii="Century Gothic" w:eastAsia="Century Gothic" w:hAnsi="Century Gothic" w:cs="Century Gothic"/>
-              </w:rPr>
-            </w:pPr>
-            <w:r>
-              <w:rPr>
-                <w:rStyle w:val="divdocumentright-box"/>
-                <w:rFonts w:ascii="Century Gothic" w:eastAsia="Century Gothic" w:hAnsi="Century Gothic" w:cs="Century Gothic"/>
-              </w:rPr>
-              <w:t> </w:t>
             </w:r>
           </w:p>
           <w:tbl>
@@ -3792,7 +3914,6 @@
   <w:style w:type="character" w:default="1" w:styleId="DefaultParagraphFont">
     <w:name w:val="Default Paragraph Font"/>
     <w:uiPriority w:val="1"/>
-    <w:semiHidden/>
     <w:unhideWhenUsed/>
   </w:style>
   <w:style w:type="table" w:default="1" w:styleId="TableNormal">

</xml_diff>